<commit_message>
Edited Business Viewpoint and References
</commit_message>
<xml_diff>
--- a/Business Viewpoint Analysis.docx
+++ b/Business Viewpoint Analysis.docx
@@ -14,6 +14,46 @@
           <w:lang w:val="en-US"/>
         </w:rPr>
         <w:t>Business Viewpoint Analysis</w:t>
+      </w:r>
+    </w:p>
+    <w:p>
+      <w:pPr>
+        <w:rPr>
+          <w:lang w:val="en-GB"/>
+        </w:rPr>
+      </w:pPr>
+      <w:r>
+        <w:rPr>
+          <w:lang w:val="en-GB"/>
+        </w:rPr>
+        <w:t>In the early 2000’s, the popularity of videogames increased substantially due to the introduction of online gaming and mobile games. Online games saw a huge increase in profit, with World of Warcraft peaking at over 14 million monthly subscribers. Meanwhile in 2007, Apple released the iPhone. The release of the App Store brought in a new audience for mobile gaming, which only increased when Angry Birds and Candy Crush Saga released, which became largely popular among users. (Wallach, 2020)</w:t>
+      </w:r>
+    </w:p>
+    <w:p>
+      <w:pPr>
+        <w:rPr>
+          <w:lang w:val="en-GB"/>
+        </w:rPr>
+      </w:pPr>
+      <w:r>
+        <w:rPr>
+          <w:lang w:val="en-GB"/>
+        </w:rPr>
+        <w:t xml:space="preserve">In terms of business, the online gaming market has seen </w:t>
+      </w:r>
+      <w:proofErr w:type="gramStart"/>
+      <w:r>
+        <w:rPr>
+          <w:lang w:val="en-GB"/>
+        </w:rPr>
+        <w:t>positive growth</w:t>
+      </w:r>
+      <w:proofErr w:type="gramEnd"/>
+      <w:r>
+        <w:rPr>
+          <w:lang w:val="en-GB"/>
+        </w:rPr>
+        <w:t xml:space="preserve"> over time. In 2025, the online gaming market was estimated at 257 billion USD, with Esports gaining a large increase of participants. (Mahajan, 2026)</w:t>
       </w:r>
     </w:p>
     <w:p>
@@ -82,15 +122,7 @@
           <w:bCs/>
           <w:lang w:val="en-US"/>
         </w:rPr>
-        <w:t>Constant online payments</w:t>
-      </w:r>
-      <w:r>
-        <w:rPr>
-          <w:b/>
-          <w:bCs/>
-          <w:lang w:val="en-US"/>
-        </w:rPr>
-        <w:t xml:space="preserve">: </w:t>
+        <w:t xml:space="preserve">Constant online payments: </w:t>
       </w:r>
       <w:r>
         <w:rPr>
@@ -356,6 +388,7 @@
           <w:bCs/>
           <w:lang w:val="en-US"/>
         </w:rPr>
+        <w:lastRenderedPageBreak/>
         <w:t xml:space="preserve">Cross-platform implementation: </w:t>
       </w:r>
       <w:r>
@@ -1404,7 +1437,6 @@
   <w:style w:type="character" w:default="1" w:styleId="DefaultParagraphFont">
     <w:name w:val="Default Paragraph Font"/>
     <w:uiPriority w:val="1"/>
-    <w:semiHidden/>
     <w:unhideWhenUsed/>
   </w:style>
   <w:style w:type="table" w:default="1" w:styleId="TableNormal">

</xml_diff>

<commit_message>
Added section at start
</commit_message>
<xml_diff>
--- a/Business Viewpoint Analysis.docx
+++ b/Business Viewpoint Analysis.docx
@@ -54,6 +54,12 @@
           <w:lang w:val="en-GB"/>
         </w:rPr>
         <w:t xml:space="preserve"> over time. In 2025, the online gaming market was estimated at 257 billion USD, with Esports gaining a large increase of participants. (Mahajan, 2026)</w:t>
+      </w:r>
+      <w:r>
+        <w:rPr>
+          <w:lang w:val="en-GB"/>
+        </w:rPr>
+        <w:t>.</w:t>
       </w:r>
     </w:p>
     <w:p>
@@ -1437,6 +1443,7 @@
   <w:style w:type="character" w:default="1" w:styleId="DefaultParagraphFont">
     <w:name w:val="Default Paragraph Font"/>
     <w:uiPriority w:val="1"/>
+    <w:semiHidden/>
     <w:unhideWhenUsed/>
   </w:style>
   <w:style w:type="table" w:default="1" w:styleId="TableNormal">

</xml_diff>